<commit_message>
Actualizar el ERS con la infraestructura de pruebas del backend
El estado actual de RA-02 (cobertura progresiva de pruebas automaticas) deja de decir que la suite no existe y se agrega un parrafo sobre el entorno aislado de pruebas. Se actualizan el documento Word y su PDF vigente, y se conserva la copia de la version anterior, para que el ERS coincida con lo que implemento la spec 002.
</commit_message>
<xml_diff>
--- a/Documentacion/Documentacion_ServIA_2026/ERS_Avances de desarrollo - ServIA.docx
+++ b/Documentacion/Documentacion_ServIA_2026/ERS_Avances de desarrollo - ServIA.docx
@@ -6162,7 +6162,22 @@
                 <w:sz w:val="20"/>
                 <w:szCs w:val="20"/>
               </w:rPr>
-              <w:t xml:space="preserve">Ningún requisito se da por cumplido solo con verificación manual: cada uno debe cubrirse con pruebas automatizadas (unitarias, de integración y de extremo a extremo), además de la verificación manual de punta a punta. Por el tamaño del equipo (RA-01) y el período de la práctica, el código heredado de JusticIA, que no tiene pruebas automatizadas, se cubre de forma progresiva, priorizando los flujos críticos y los módulos de mayor riesgo, con la meta de al menos una prueba automatizada por requisito y no la cobertura total del código. Estado actual: la suite de pruebas automatizadas todavía no existe; mientras se incorpora, la verificación funcional se realiza de forma manual.</w:t>
+              <w:t xml:space="preserve">Ningún requisito se da por cumplido solo con verificación manual: cada uno debe cubrirse con pruebas automatizadas (unitarias, de integración y de extremo a extremo), además de la verificación manual de punta a punta. Por el tamaño del equipo (RA-01) y el período de la práctica, el código heredado de JusticIA, que no tiene pruebas automatizadas, se cubre de forma progresiva, priorizando los flujos críticos y los módulos de mayor riesgo, con la meta de al menos una prueba automatizada por requisito y no la cobertura total del código. Estado actual: la infraestructura de pruebas del backend existe y se ejecuta con un solo comando; la cobertura sigue siendo progresiva y el extremo a extremo llega con la spec de la red de seguridad.</w:t>
+            </w:r>
+          </w:p>
+          <w:p>
+            <w:pPr>
+              <w:spacing w:after="60"/>
+            </w:pPr>
+            <w:r>
+              <w:rPr>
+                <w:rFonts w:ascii="Calibri" w:cs="Calibri" w:eastAsia="Calibri" w:hAnsi="Calibri"/>
+                <w:b w:val="false"/>
+                <w:bCs w:val="false"/>
+                <w:sz w:val="20"/>
+                <w:szCs w:val="20"/>
+              </w:rPr>
+              <w:t xml:space="preserve">Las pruebas del backend corren en un entorno aislado: una base de datos y una colección vectorial exclusivas para pruebas, que se crean al iniciar la corrida y se eliminan al terminar sin tocar los datos de desarrollo. Usan solo datos inventados, simulan Redis, el modelo de lenguaje, el reconocimiento de escritura, el audio y el correo (sin servicios de IA externos, RNF-09), y cada prueba elimina lo que crea. Ese borrado de datos de prueba no contradice RN-01, que rige los datos del sistema.</w:t>
             </w:r>
           </w:p>
         </w:tc>

</xml_diff>